<commit_message>
CLÍNICA ALMA 1부 통합본 + 기획서 v2.1 docx·pdf + README 1부 완료
Co-Authored-By: Claude Opus 5.5 <noreply@anthropic.com>
Claude-Session: https://claude.ai/code/session_01N4vhCLeYxrjvGnDxQBD9Cq
</commit_message>
<xml_diff>
--- a/clinica-alma/ClinicaAlma_기획서.docx
+++ b/clinica-alma/ClinicaAlma_기획서.docx
@@ -17,6 +17,22 @@
       </w:pPr>
       <w:r>
         <w:t xml:space="preserve">스페인어 비즈니스 회화 드라마 · 8부 120화 · 화당 120턴 · B1 → C1+</w:t>
+      </w:r>
+      <w:r>
+        <w:t xml:space="preserve"> </w:t>
+      </w:r>
+      <w:r>
+        <w:rPr>
+          <w:bCs/>
+          <w:b/>
+        </w:rPr>
+        <w:t xml:space="preserve">v2.1:</w:t>
+      </w:r>
+      <w:r>
+        <w:t xml:space="preserve"> </w:t>
+      </w:r>
+      <w:r>
+        <w:t xml:space="preserve">주인공을 남성 의사 마테오 에레라로 변경.</w:t>
       </w:r>
       <w:r>
         <w:t xml:space="preserve"> </w:t>
@@ -325,7 +341,7 @@
               <w:t xml:space="preserve"> </w:t>
             </w:r>
             <w:r>
-              <w:t xml:space="preserve">— 스페인(마드리드·바르셀로나·안달루시아), 포르투갈 국경 지대, 멕시코, 콜롬비아, 아르헨티나 변이 포함. 한국어 번역은 화 말미에 모음</w:t>
+              <w:t xml:space="preserve">— 스페인(마드리드·바르셀로나·안달마테오), 포르투갈 국경 지대, 멕시코, 콜롬비아, 아르헨티나 변이 포함. 한국어 번역은 화 말미에 모음</w:t>
             </w:r>
           </w:p>
         </w:tc>
@@ -647,7 +663,7 @@
         <w:t xml:space="preserve"> </w:t>
       </w:r>
       <w:r>
-        <w:t xml:space="preserve">마드리드의 tú와 vale, 바르셀로나의 카탈루냐어, 세비야의 안달루시아 억양, 리스본의 포르투뇰, 멕시코의 usted과 ahorita, 보고타의 usted(친구 사이에도), 메데인의 parcero, 부에노스아이레스의 vos.</w:t>
+        <w:t xml:space="preserve">마드리드의 tú와 vale, 바르셀로나의 카탈루냐어, 세비야의 안달마테오 억양, 리스본의 포르투뇰, 멕시코의 usted과 ahorita, 보고타의 usted(친구 사이에도), 메데인의 parcero, 부에노스아이레스의 vos.</w:t>
       </w:r>
     </w:p>
     <w:p>
@@ -669,7 +685,7 @@
         <w:t xml:space="preserve"> </w:t>
       </w:r>
       <w:r>
-        <w:t xml:space="preserve">마드리드·카탈루냐는 직판, 안달루시아·레반테·갈리시아·카나리아·포르투갈은 지역 서브 딜러(subdistribuidor)를 통해. 서브 딜러는 지역의 의사를 30년째 알고, 창고가 있고, 외상을 견딘다. 대신 알마의 원칙을</w:t>
+        <w:t xml:space="preserve">마드리드·카탈루냐는 직판, 안달마테오·레반테·갈리시아·카나리아·포르투갈은 지역 서브 딜러(subdistribuidor)를 통해. 서브 딜러는 지역의 의사를 30년째 알고, 창고가 있고, 외상을 견딘다. 대신 알마의 원칙을</w:t>
       </w:r>
       <w:r>
         <w:t xml:space="preserve"> </w:t>
@@ -739,7 +755,7 @@
         <w:t xml:space="preserve"> </w:t>
       </w:r>
       <w:r>
-        <w:t xml:space="preserve">Clínica Alma S.L.P.(마드리드 참베리, 의사 루시아의 클리닉 — 끝까지 1~2곳만 유지)</w:t>
+        <w:t xml:space="preserve">Clínica Alma S.L.P.(마드리드 참베리, 의사 마테오의 클리닉 — 끝까지 1~2곳만 유지)</w:t>
       </w:r>
     </w:p>
     <w:p>
@@ -946,7 +962,7 @@
               <w:jc w:val="left"/>
             </w:pPr>
             <w:r>
-              <w:t xml:space="preserve">안달루시아·엑스트레마두라</w:t>
+              <w:t xml:space="preserve">안달마테오·엑스트레마두라</w:t>
             </w:r>
           </w:p>
         </w:tc>
@@ -2098,7 +2114,7 @@
               <w:jc w:val="left"/>
             </w:pPr>
             <w:r>
-              <w:t xml:space="preserve">€220K(루시아 저축 + 은행 + 하비에르)</w:t>
+              <w:t xml:space="preserve">€220K(마테오 저축 + 은행 + 하비에르)</w:t>
             </w:r>
           </w:p>
         </w:tc>
@@ -2384,10 +2400,10 @@
           <w:bCs/>
           <w:b/>
         </w:rPr>
-        <w:t xml:space="preserve">Dra. Lucía Herrera</w:t>
-      </w:r>
-      <w:r>
-        <w:t xml:space="preserve">(39, LUCIA) — 의사, 미용의학 석사. 병원 피부과에서 일하다 참베리에 클리닉을 연다. 환자 앞에선 부드럽고 협상에선 단호함. 유통을 시작한 뒤에도 매주 목요일은 진료실에 앉는다. 습관어 «Primero, no hacer daño.»(우선, 해를 끼치지 말 것.)</w:t>
+        <w:t xml:space="preserve">Dr. Mateo Herrera</w:t>
+      </w:r>
+      <w:r>
+        <w:t xml:space="preserve">(39, MATEO) — 피부과 전문의, 미용의학 석사. 마드리드의 대학병원 피부과에서 12년(응급실 당직 겸무). 아빌라주 피에드라이타 출신. 아버지 안토니오(70)는 마을 약국을 40년 지킨 약사 — «Lo que no sabes de dónde viene, no lo vendes.»(어디서 왔는지 모르는 건 팔지 마라)가 집안의 말. 이혼, 딸 소피아(9)와 격주 주말. 환자 앞에선 부드럽고 협상에선 단호함. 말이 짧고 메모를 많이 함. 유통을 시작한 뒤에도 매주 목요일은 진료실에 앉는다. 습관어 «Primero, no hacer daño.»(우선, 해를 끼치지 말 것.)</w:t>
       </w:r>
     </w:p>
     <w:p>
@@ -2406,7 +2422,7 @@
         <w:t xml:space="preserve">Javier Montoya</w:t>
       </w:r>
       <w:r>
-        <w:t xml:space="preserve">(42, JAVIER) — 전 은행원(기업 여신 담당), 재무·운영·물류. 엑셀과 아틀레티코. 매출채권 표를 기도문처럼 읽는다. «¿Y eso cuánto cuesta?»</w:t>
+        <w:t xml:space="preserve">(42, JAVIER) — 마테오의 피에드라이타 학교 친구. 「방코 카스테야노」(가상) 참베리 지점 기업 여신 담당 → 1부 말 퇴사, 재무·운영·물류. 아내 아나, 아들 둘. 엑셀과 아틀레티코. 매출채권 표를 기도문처럼 읽는다. «¿Y eso cuánto cuesta?»</w:t>
       </w:r>
     </w:p>
     <w:p>
@@ -2440,7 +2456,7 @@
         <w:t xml:space="preserve">”</w:t>
       </w:r>
       <w:r>
-        <w:t xml:space="preserve">의 비용을 가장 먼저 계산해 루시아와 충돌.</w:t>
+        <w:t xml:space="preserve">의 비용을 가장 먼저 계산해 마테오와 충돌.</w:t>
       </w:r>
     </w:p>
     <w:bookmarkEnd w:id="25"/>
@@ -2634,7 +2650,7 @@
         <w:t xml:space="preserve">Paco Navarro</w:t>
       </w:r>
       <w:r>
-        <w:t xml:space="preserve">(58, PACO) — 세비야 «Navarro Estética» 3대째 대표. 안달루시아 억양, 악수와 외상, 의사들의 대부. 보고서는 싫지만 약속은 지킨다. 8부에서 서브 딜러 대표로 연설. «Aquí la palabra vale más que el papel… pero firmo, ¿eh?»</w:t>
+        <w:t xml:space="preserve">(58, PACO) — 세비야 «Navarro Estética» 3대째 대표. 안달마테오 억양, 악수와 외상, 의사들의 대부. 보고서는 싫지만 약속은 지킨다. 8부에서 서브 딜러 대표로 연설. «Aquí la palabra vale más que el papel… pero firmo, ¿eh?»</w:t>
       </w:r>
     </w:p>
     <w:p>
@@ -2777,7 +2793,7 @@
         <w:t xml:space="preserve">박민재 / Minjae Park</w:t>
       </w:r>
       <w:r>
-        <w:t xml:space="preserve">(38, MINJAE) — 다온메드 해외사업팀장. 숫자·분기 목표·최소 구매량. 8부 직판 계획의 실무자. 악역이 아니라</w:t>
+        <w:t xml:space="preserve">(38, MINJAE) — 다온메드 해외사업팀장. 멕시코시티 주재 2년 — 멕시코식 스페인어(ahorita, ¿mande?)를 한다. 숫자·분기 목표·최소 구매량. 8부 직판 계획의 실무자. 악역이 아니라</w:t>
       </w:r>
       <w:r>
         <w:t xml:space="preserve"> </w:t>
@@ -3726,7 +3742,7 @@
               <w:jc w:val="left"/>
             </w:pPr>
             <w:r>
-              <w:t xml:space="preserve">병원을 떠난 루시아가 참베리에 클리닉을 연다. 그런데 필러 공급사가 늦고, 미용실에도 판다. 서울 학회에서 준서가 다온메드를 소개한다.</w:t>
+              <w:t xml:space="preserve">병원을 떠난 마테오가 참베리에 클리닉을 연다. 그런데 필러 공급사가 늦고, 미용실에도 판다. 서울 학회에서 준서가 다온메드를 소개한다.</w:t>
             </w:r>
           </w:p>
         </w:tc>
@@ -4122,7 +4138,7 @@
               <w:jc w:val="left"/>
             </w:pPr>
             <w:r>
-              <w:t xml:space="preserve">보고타·메데인, INVIMA, 의료관광 패키지 거절. 부에노스아이레스의 준서 가족. 루시아의 번아웃.</w:t>
+              <w:t xml:space="preserve">보고타·메데인, INVIMA, 의료관광 패키지 거절. 부에노스아이레스의 준서 가족. 마테오의 번아웃.</w:t>
             </w:r>
           </w:p>
         </w:tc>
@@ -4200,7 +4216,7 @@
               <w:t xml:space="preserve"> </w:t>
             </w:r>
             <w:r>
-              <w:t xml:space="preserve">조건, 서브 딜러 망은 정리 대상. 의사들과 서브 딜러들의 서한. 새 계약. 루시아는 목요일의 진료실로.</w:t>
+              <w:t xml:space="preserve">조건, 서브 딜러 망은 정리 대상. 의사들과 서브 딜러들의 서한. 새 계약. 마테오는 목요일의 진료실로.</w:t>
             </w:r>
           </w:p>
         </w:tc>
@@ -4981,7 +4997,7 @@
               <w:jc w:val="left"/>
             </w:pPr>
             <w:r>
-              <w:t xml:space="preserve">서울 학회, 준서와 첫 만남(vos). 오송 다온메드 공장 견학.</w:t>
+              <w:t xml:space="preserve">서울 학회, 준서와 첫 만남(vos). 강남 클리닉 견학, «Lumen»을 처음 써 본다.</w:t>
             </w:r>
           </w:p>
         </w:tc>
@@ -5031,7 +5047,7 @@
               <w:jc w:val="left"/>
             </w:pPr>
             <w:r>
-              <w:t xml:space="preserve">다온메드엔 스페인 유통사가 없다. 준서의 한마디(→2부).</w:t>
+              <w:t xml:space="preserve">오송 다온메드 공장 견학(박민재 안내, 한지수 대표와 짧은 인사). 스페인 유통사가 없다. 준서의 한마디(→2부).</w:t>
             </w:r>
           </w:p>
         </w:tc>
@@ -5170,7 +5186,7 @@
               <w:jc w:val="left"/>
             </w:pPr>
             <w:r>
-              <w:t xml:space="preserve">«¿Estás loca?»</w:t>
+              <w:t xml:space="preserve">«¿Estás loco?»</w:t>
             </w:r>
           </w:p>
         </w:tc>
@@ -5208,19 +5224,19 @@
               <w:jc w:val="left"/>
             </w:pPr>
             <w:r>
-              <w:t xml:space="preserve">다온메드 대표 한지수와 화상 회의. 영어와 스페인어 사이.</w:t>
-            </w:r>
-          </w:p>
-        </w:tc>
-        <w:tc>
-          <w:tcPr/>
-          <w:p>
-            <w:pPr>
-              <w:pStyle w:val="Compact"/>
-              <w:jc w:val="left"/>
-            </w:pPr>
-            <w:r>
-              <w:t xml:space="preserve">«Encantada de conocerla.»</w:t>
+              <w:t xml:space="preserve">다온메드 대표 한지수와 화상 회의, 첫 협상. 민재의 통역, 영어와 스페인어 사이.</w:t>
+            </w:r>
+          </w:p>
+        </w:tc>
+        <w:tc>
+          <w:tcPr/>
+          <w:p>
+            <w:pPr>
+              <w:pStyle w:val="Compact"/>
+              <w:jc w:val="left"/>
+            </w:pPr>
+            <w:r>
+              <w:t xml:space="preserve">«Hablemos de números.»</w:t>
             </w:r>
           </w:p>
         </w:tc>
@@ -5608,7 +5624,7 @@
               <w:jc w:val="left"/>
             </w:pPr>
             <w:r>
-              <w:t xml:space="preserve">루시아의 의대 동기, 첫 외부 주문.</w:t>
+              <w:t xml:space="preserve">마테오의 의대 동기, 첫 외부 주문.</w:t>
             </w:r>
           </w:p>
         </w:tc>
@@ -6919,7 +6935,7 @@
               <w:jc w:val="left"/>
             </w:pPr>
             <w:r>
-              <w:t xml:space="preserve">루시아가 파울라를 직접 처치(히알루로니다아제).</w:t>
+              <w:t xml:space="preserve">마테오가 파울라를 직접 처치(히알루로니다아제).</w:t>
             </w:r>
           </w:p>
         </w:tc>
@@ -8336,7 +8352,7 @@
               <w:jc w:val="left"/>
             </w:pPr>
             <w:r>
-              <w:t xml:space="preserve">마르타 사의 — 더 빨리 크고 싶다. 화해. 네레아가 클리닉 운영 총괄, 루시아는 목요일 진료만.</w:t>
+              <w:t xml:space="preserve">마르타 사의 — 더 빨리 크고 싶다. 화해. 네레아가 클리닉 운영 총괄, 마테오는 목요일 진료만.</w:t>
             </w:r>
           </w:p>
         </w:tc>
@@ -10052,7 +10068,7 @@
               <w:jc w:val="left"/>
             </w:pPr>
             <w:r>
-              <w:t xml:space="preserve">루시아의 번아웃. 목요일 진료도 빠진다.</w:t>
+              <w:t xml:space="preserve">마테오의 번아웃. 목요일 진료도 빠진다.</w:t>
             </w:r>
           </w:p>
         </w:tc>
@@ -10341,7 +10357,7 @@
               <w:jc w:val="left"/>
             </w:pPr>
             <w:r>
-              <w:t xml:space="preserve">«Nos gustaría conocerla.»</w:t>
+              <w:t xml:space="preserve">«Nos gustaría conocerlo.»</w:t>
             </w:r>
           </w:p>
         </w:tc>
@@ -10824,7 +10840,7 @@
               <w:jc w:val="left"/>
             </w:pPr>
             <w:r>
-              <w:t xml:space="preserve">루시아, 오송에서 한지수와 단둘이. 4-9의</w:t>
+              <w:t xml:space="preserve">마테오, 오송에서 한지수와 단둘이. 4-9의</w:t>
             </w:r>
             <w:r>
               <w:t xml:space="preserve"> </w:t>

</xml_diff>